<commit_message>
Reframe tool-fit message: Copilot for one-offs, Power Query for repeatable/auditable
Replace the 'structural complexity' framing with the real rule: the demo's
cleaning is one-off Copilot work, but anything repeatable or that must be
audited belongs in Power Query (recorded steps, reproducible, one-click
refresh). Updated in both the run-of-show and speaker notes.

Co-Authored-By: Claude Opus 4.8 <noreply@anthropic.com>
</commit_message>
<xml_diff>
--- a/Spotlight-Script-and-Run-of-Show.docx
+++ b/Spotlight-Script-and-Run-of-Show.docx
@@ -1877,7 +1877,7 @@
         <w:pStyle w:val="Heading2"/>
       </w:pPr>
       <w:r>
-        <w:t xml:space="preserve">The before/after + the one idea to remember (≈60 sec)</w:t>
+        <w:t xml:space="preserve">The fast win — and the real rule (≈75 sec)</w:t>
       </w:r>
     </w:p>
     <w:p>
@@ -1892,7 +1892,7 @@
           <w:sz w:val="20"/>
           <w:szCs w:val="20"/>
         </w:rPr>
-        <w:t xml:space="preserve">Flip back to the original mess for one beat, then to the clean summary. Let the contrast land.</w:t>
+        <w:t xml:space="preserve">Flip back to the original mess for one beat, then to the clean summary. Let the contrast land — then get honest about the trade-off.</w:t>
       </w:r>
     </w:p>
     <w:p>
@@ -1905,7 +1905,7 @@
           <w:sz w:val="24"/>
           <w:szCs w:val="24"/>
         </w:rPr>
-        <w:t xml:space="preserve">That's the before. That's the after. Ninety seconds of actual work.</w:t>
+        <w:t xml:space="preserve">That's the before. That's the after. Ninety seconds of actual work. But let me be straight about what just happened, because it's the whole point.</w:t>
       </w:r>
     </w:p>
     <w:p>
@@ -1918,7 +1918,7 @@
           <w:sz w:val="24"/>
           <w:szCs w:val="24"/>
         </w:rPr>
-        <w:t xml:space="preserve">One thing I want to flag, because it's the heart of how I teach. I used </w:t>
+        <w:t xml:space="preserve">Most of what I just did is data cleaning. If this is a </w:t>
       </w:r>
       <w:r>
         <w:rPr>
@@ -1928,15 +1928,28 @@
           <w:sz w:val="24"/>
           <w:szCs w:val="24"/>
         </w:rPr>
-        <w:t xml:space="preserve">Copilot</w:t>
-      </w:r>
-      <w:r>
-        <w:rPr>
-          <w:color w:val="1A1A1A"/>
-          <w:sz w:val="24"/>
-          <w:szCs w:val="24"/>
-        </w:rPr>
-        <w:t xml:space="preserve"> here because the data was already row-and-column shaped — it just had dirt in the cells. If this file had shown up with the columns split wrong, or three reports stacked on one sheet, </w:t>
+        <w:t xml:space="preserve">one-time job</w:t>
+      </w:r>
+      <w:r>
+        <w:rPr>
+          <w:color w:val="1A1A1A"/>
+          <w:sz w:val="24"/>
+          <w:szCs w:val="24"/>
+        </w:rPr>
+        <w:t xml:space="preserve"> — clean it once and move on — Copilot is exactly the right tool. Fast, plain English, done.</w:t>
+      </w:r>
+    </w:p>
+    <w:p>
+      <w:pPr>
+        <w:spacing w:after="120" w:line="300"/>
+      </w:pPr>
+      <w:r>
+        <w:rPr>
+          <w:color w:val="1A1A1A"/>
+          <w:sz w:val="24"/>
+          <w:szCs w:val="24"/>
+        </w:rPr>
+        <w:t xml:space="preserve">But if this is a report you rebuild </w:t>
       </w:r>
       <w:r>
         <w:rPr>
@@ -1946,15 +1959,74 @@
           <w:sz w:val="24"/>
           <w:szCs w:val="24"/>
         </w:rPr>
-        <w:t xml:space="preserve">that's not a Copilot job — that's Power Query.</w:t>
-      </w:r>
-      <w:r>
-        <w:rPr>
-          <w:color w:val="1A1A1A"/>
-          <w:sz w:val="24"/>
-          <w:szCs w:val="24"/>
-        </w:rPr>
-        <w:t xml:space="preserve"> Knowing which tool fits which mess is the difference between fighting your data all afternoon and finishing early. That judgment is most of what the full course is about.</w:t>
+        <w:t xml:space="preserve">every month</w:t>
+      </w:r>
+      <w:r>
+        <w:rPr>
+          <w:color w:val="1A1A1A"/>
+          <w:sz w:val="24"/>
+          <w:szCs w:val="24"/>
+        </w:rPr>
+        <w:t xml:space="preserve">, or one that someone has to be able to </w:t>
+      </w:r>
+      <w:r>
+        <w:rPr>
+          <w:b/>
+          <w:bCs/>
+          <w:color w:val="1A1A1A"/>
+          <w:sz w:val="24"/>
+          <w:szCs w:val="24"/>
+        </w:rPr>
+        <w:t xml:space="preserve">audit</w:t>
+      </w:r>
+      <w:r>
+        <w:rPr>
+          <w:color w:val="1A1A1A"/>
+          <w:sz w:val="24"/>
+          <w:szCs w:val="24"/>
+        </w:rPr>
+        <w:t xml:space="preserve">, it belongs in </w:t>
+      </w:r>
+      <w:r>
+        <w:rPr>
+          <w:b/>
+          <w:bCs/>
+          <w:color w:val="1A1A1A"/>
+          <w:sz w:val="24"/>
+          <w:szCs w:val="24"/>
+        </w:rPr>
+        <w:t xml:space="preserve">Power Query</w:t>
+      </w:r>
+      <w:r>
+        <w:rPr>
+          <w:color w:val="1A1A1A"/>
+          <w:sz w:val="24"/>
+          <w:szCs w:val="24"/>
+        </w:rPr>
+        <w:t xml:space="preserve"> — every step recorded, reproducible and auditable, and refreshed with a single click.</w:t>
+      </w:r>
+    </w:p>
+    <w:p>
+      <w:pPr>
+        <w:spacing w:after="120" w:line="300"/>
+      </w:pPr>
+      <w:r>
+        <w:rPr>
+          <w:b/>
+          <w:bCs/>
+          <w:color w:val="1A1A1A"/>
+          <w:sz w:val="24"/>
+          <w:szCs w:val="24"/>
+        </w:rPr>
+        <w:t xml:space="preserve">That's the real rule: Copilot for one-offs and quick exploring; Power Query for anything repeatable or that has to be audited.</w:t>
+      </w:r>
+      <w:r>
+        <w:rPr>
+          <w:color w:val="1A1A1A"/>
+          <w:sz w:val="24"/>
+          <w:szCs w:val="24"/>
+        </w:rPr>
+        <w:t xml:space="preserve"> Knowing which situation you're in is most of what the full course is about.</w:t>
       </w:r>
     </w:p>
     <w:p>
@@ -3378,7 +3450,7 @@
                 <w:sz w:val="20"/>
                 <w:szCs w:val="20"/>
               </w:rPr>
-              <w:t xml:space="preserve">(optional) Before → After framing</w:t>
+              <w:t xml:space="preserve">Copilot or Power Query? — the tool-fit rule</w:t>
             </w:r>
           </w:p>
         </w:tc>
@@ -3408,7 +3480,7 @@
                 <w:sz w:val="20"/>
                 <w:szCs w:val="20"/>
               </w:rPr>
-              <w:t xml:space="preserve">Bookend the demo if you want</w:t>
+              <w:t xml:space="preserve">Right after the demo</w:t>
             </w:r>
           </w:p>
         </w:tc>

</xml_diff>

<commit_message>
Add Appendix D: back-pocket Power Query flex cards to run-of-show
Optional, deploy-if-time content so George can extend the demo on the fly:
the 45-second Applied Steps audit-trail beat, AI prompts to clean up/explain
generated M code, prompts to generate a stuck PQ step or fix an error, and
bonus Copilot prompts for the core demo.

Co-Authored-By: Claude Opus 4.8 <noreply@anthropic.com>
</commit_message>
<xml_diff>
--- a/Spotlight-Script-and-Run-of-Show.docx
+++ b/Spotlight-Script-and-Run-of-Show.docx
@@ -3762,6 +3762,483 @@
         </w:tc>
       </w:tr>
     </w:tbl>
+    <w:p>
+      <w:pPr>
+        <w:pageBreakBefore/>
+      </w:pPr>
+      <w:r>
+        <w:t xml:space="preserve"/>
+      </w:r>
+    </w:p>
+    <w:p>
+      <w:pPr>
+        <w:pStyle w:val="Heading1"/>
+      </w:pPr>
+      <w:r>
+        <w:t xml:space="preserve">Appendix D — Back-pocket Power Query cards (deploy only if you have time)</w:t>
+      </w:r>
+    </w:p>
+    <w:p>
+      <w:pPr>
+        <w:spacing w:after="120"/>
+      </w:pPr>
+      <w:r>
+        <w:rPr>
+          <w:color w:val="6B6B6B"/>
+          <w:sz w:val="21"/>
+          <w:szCs w:val="21"/>
+        </w:rPr>
+        <w:t xml:space="preserve">Optional flex content. If you're flying through the core demo and have minutes to spare, pull one of these. Each is a self-contained 1–2 minute beat that reinforces “Copilot for one-offs, Power Query for repeatable.” Skip freely — none of it is load-bearing.</w:t>
+      </w:r>
+    </w:p>
+    <w:p>
+      <w:pPr>
+        <w:pStyle w:val="Heading2"/>
+      </w:pPr>
+      <w:r>
+        <w:t xml:space="preserve">Card 1 — the 45-second audit-trail beat (no AI needed)</w:t>
+      </w:r>
+    </w:p>
+    <w:p>
+      <w:pPr>
+        <w:spacing w:after="120" w:line="300"/>
+      </w:pPr>
+      <w:r>
+        <w:rPr>
+          <w:color w:val="1A1A1A"/>
+          <w:sz w:val="24"/>
+          <w:szCs w:val="24"/>
+        </w:rPr>
+        <w:t xml:space="preserve">Open the file in Power Query, point at the </w:t>
+      </w:r>
+      <w:r>
+        <w:rPr>
+          <w:b/>
+          <w:bCs/>
+          <w:color w:val="1A1A1A"/>
+          <w:sz w:val="24"/>
+          <w:szCs w:val="24"/>
+        </w:rPr>
+        <w:t xml:space="preserve">Applied Steps</w:t>
+      </w:r>
+      <w:r>
+        <w:rPr>
+          <w:color w:val="1A1A1A"/>
+          <w:sz w:val="24"/>
+          <w:szCs w:val="24"/>
+        </w:rPr>
+        <w:t xml:space="preserve"> pane on the right, and say: “This is the part Copilot can't give you — every step I took, in order, that anyone can read and audit. And next month, when a new file lands, I don't redo any of this. I just hit Refresh.” Then click Refresh once and let it re-run.</w:t>
+      </w:r>
+    </w:p>
+    <w:p>
+      <w:pPr>
+        <w:spacing w:after="60"/>
+      </w:pPr>
+      <w:r>
+        <w:t xml:space="preserve"/>
+      </w:r>
+    </w:p>
+    <w:p>
+      <w:pPr>
+        <w:pStyle w:val="Heading2"/>
+      </w:pPr>
+      <w:r>
+        <w:t xml:space="preserve">Card 2 — ask AI to clean up your generated M code</w:t>
+      </w:r>
+    </w:p>
+    <w:p>
+      <w:pPr>
+        <w:spacing w:after="80"/>
+      </w:pPr>
+      <w:r>
+        <w:rPr>
+          <w:color w:val="6B6B6B"/>
+          <w:sz w:val="21"/>
+          <w:szCs w:val="21"/>
+        </w:rPr>
+        <w:t xml:space="preserve">Paste these into Claude or ChatGPT along with your M code (in Power Query: Home → Advanced Editor → copy).</w:t>
+      </w:r>
+    </w:p>
+    <w:tbl>
+      <w:tblPr>
+        <w:tblW w:type="dxa" w:w="9360"/>
+        <w:tblBorders>
+          <w:top w:val="single" w:color="auto" w:sz="4"/>
+          <w:left w:val="single" w:color="auto" w:sz="4"/>
+          <w:bottom w:val="single" w:color="auto" w:sz="4"/>
+          <w:right w:val="single" w:color="auto" w:sz="4"/>
+          <w:insideH w:val="single" w:color="auto" w:sz="4"/>
+          <w:insideV w:val="single" w:color="auto" w:sz="4"/>
+        </w:tblBorders>
+        <w:tblCellMar>
+          <w:top w:type="dxa" w:w="60"/>
+          <w:bottom w:type="dxa" w:w="60"/>
+        </w:tblCellMar>
+      </w:tblPr>
+      <w:tblGrid>
+        <w:gridCol w:w="9360"/>
+      </w:tblGrid>
+      <w:tr>
+        <w:tc>
+          <w:tcPr>
+            <w:tcW w:type="dxa" w:w="9360"/>
+            <w:tcBorders>
+              <w:top w:val="single" w:color="111111" w:sz="4"/>
+              <w:left w:val="single" w:color="111111" w:sz="18"/>
+              <w:bottom w:val="single" w:color="111111" w:sz="4"/>
+              <w:right w:val="single" w:color="111111" w:sz="4"/>
+            </w:tcBorders>
+            <w:shd w:fill="F1F1F1" w:val="clear"/>
+            <w:tcMar>
+              <w:top w:type="dxa" w:w="120"/>
+              <w:left w:type="dxa" w:w="180"/>
+              <w:bottom w:type="dxa" w:w="120"/>
+              <w:right w:type="dxa" w:w="180"/>
+            </w:tcMar>
+          </w:tcPr>
+          <w:p>
+            <w:pPr>
+              <w:spacing w:after="60"/>
+            </w:pPr>
+            <w:r>
+              <w:rPr>
+                <w:b/>
+                <w:bCs/>
+                <w:caps/>
+                <w:color w:val="111111"/>
+                <w:sz w:val="17"/>
+                <w:szCs w:val="17"/>
+              </w:rPr>
+              <w:t xml:space="preserve">⌨  Clean up the M</w:t>
+            </w:r>
+          </w:p>
+          <w:p>
+            <w:r>
+              <w:rPr>
+                <w:rFonts w:ascii="Consolas" w:cs="Consolas" w:eastAsia="Consolas" w:hAnsi="Consolas"/>
+                <w:color w:val="1A1A1A"/>
+                <w:sz w:val="21"/>
+                <w:szCs w:val="21"/>
+              </w:rPr>
+              <w:t xml:space="preserve">Clean up this Power Query M code: rename each step to something readable, add a short plain-English comment on each, and simplify anything redundant — without changing the output. [paste your M code]</w:t>
+            </w:r>
+          </w:p>
+        </w:tc>
+      </w:tr>
+    </w:tbl>
+    <w:p>
+      <w:pPr>
+        <w:spacing w:after="60"/>
+      </w:pPr>
+      <w:r>
+        <w:t xml:space="preserve"/>
+      </w:r>
+    </w:p>
+    <w:tbl>
+      <w:tblPr>
+        <w:tblW w:type="dxa" w:w="9360"/>
+        <w:tblBorders>
+          <w:top w:val="single" w:color="auto" w:sz="4"/>
+          <w:left w:val="single" w:color="auto" w:sz="4"/>
+          <w:bottom w:val="single" w:color="auto" w:sz="4"/>
+          <w:right w:val="single" w:color="auto" w:sz="4"/>
+          <w:insideH w:val="single" w:color="auto" w:sz="4"/>
+          <w:insideV w:val="single" w:color="auto" w:sz="4"/>
+        </w:tblBorders>
+        <w:tblCellMar>
+          <w:top w:type="dxa" w:w="60"/>
+          <w:bottom w:type="dxa" w:w="60"/>
+        </w:tblCellMar>
+      </w:tblPr>
+      <w:tblGrid>
+        <w:gridCol w:w="9360"/>
+      </w:tblGrid>
+      <w:tr>
+        <w:tc>
+          <w:tcPr>
+            <w:tcW w:type="dxa" w:w="9360"/>
+            <w:tcBorders>
+              <w:top w:val="single" w:color="111111" w:sz="4"/>
+              <w:left w:val="single" w:color="111111" w:sz="18"/>
+              <w:bottom w:val="single" w:color="111111" w:sz="4"/>
+              <w:right w:val="single" w:color="111111" w:sz="4"/>
+            </w:tcBorders>
+            <w:shd w:fill="F1F1F1" w:val="clear"/>
+            <w:tcMar>
+              <w:top w:type="dxa" w:w="120"/>
+              <w:left w:type="dxa" w:w="180"/>
+              <w:bottom w:type="dxa" w:w="120"/>
+              <w:right w:type="dxa" w:w="180"/>
+            </w:tcMar>
+          </w:tcPr>
+          <w:p>
+            <w:pPr>
+              <w:spacing w:after="60"/>
+            </w:pPr>
+            <w:r>
+              <w:rPr>
+                <w:b/>
+                <w:bCs/>
+                <w:caps/>
+                <w:color w:val="111111"/>
+                <w:sz w:val="17"/>
+                <w:szCs w:val="17"/>
+              </w:rPr>
+              <w:t xml:space="preserve">⌨  Explain the M</w:t>
+            </w:r>
+          </w:p>
+          <w:p>
+            <w:r>
+              <w:rPr>
+                <w:rFonts w:ascii="Consolas" w:cs="Consolas" w:eastAsia="Consolas" w:hAnsi="Consolas"/>
+                <w:color w:val="1A1A1A"/>
+                <w:sz w:val="21"/>
+                <w:szCs w:val="21"/>
+              </w:rPr>
+              <w:t xml:space="preserve">Here's the M code Power Query generated for this query. Walk me through what each step does in plain English, like you're explaining it to an analyst who has never seen M before. [paste your M code]</w:t>
+            </w:r>
+          </w:p>
+        </w:tc>
+      </w:tr>
+    </w:tbl>
+    <w:p>
+      <w:pPr>
+        <w:spacing w:after="60"/>
+      </w:pPr>
+      <w:r>
+        <w:t xml:space="preserve"/>
+      </w:r>
+    </w:p>
+    <w:p>
+      <w:pPr>
+        <w:pStyle w:val="Heading2"/>
+      </w:pPr>
+      <w:r>
+        <w:t xml:space="preserve">Card 3 — ask AI for the Power Query step you're stuck on</w:t>
+      </w:r>
+    </w:p>
+    <w:tbl>
+      <w:tblPr>
+        <w:tblW w:type="dxa" w:w="9360"/>
+        <w:tblBorders>
+          <w:top w:val="single" w:color="auto" w:sz="4"/>
+          <w:left w:val="single" w:color="auto" w:sz="4"/>
+          <w:bottom w:val="single" w:color="auto" w:sz="4"/>
+          <w:right w:val="single" w:color="auto" w:sz="4"/>
+          <w:insideH w:val="single" w:color="auto" w:sz="4"/>
+          <w:insideV w:val="single" w:color="auto" w:sz="4"/>
+        </w:tblBorders>
+        <w:tblCellMar>
+          <w:top w:type="dxa" w:w="60"/>
+          <w:bottom w:type="dxa" w:w="60"/>
+        </w:tblCellMar>
+      </w:tblPr>
+      <w:tblGrid>
+        <w:gridCol w:w="9360"/>
+      </w:tblGrid>
+      <w:tr>
+        <w:tc>
+          <w:tcPr>
+            <w:tcW w:type="dxa" w:w="9360"/>
+            <w:tcBorders>
+              <w:top w:val="single" w:color="111111" w:sz="4"/>
+              <w:left w:val="single" w:color="111111" w:sz="18"/>
+              <w:bottom w:val="single" w:color="111111" w:sz="4"/>
+              <w:right w:val="single" w:color="111111" w:sz="4"/>
+            </w:tcBorders>
+            <w:shd w:fill="F1F1F1" w:val="clear"/>
+            <w:tcMar>
+              <w:top w:type="dxa" w:w="120"/>
+              <w:left w:type="dxa" w:w="180"/>
+              <w:bottom w:type="dxa" w:w="120"/>
+              <w:right w:type="dxa" w:w="180"/>
+            </w:tcMar>
+          </w:tcPr>
+          <w:p>
+            <w:pPr>
+              <w:spacing w:after="60"/>
+            </w:pPr>
+            <w:r>
+              <w:rPr>
+                <w:b/>
+                <w:bCs/>
+                <w:caps/>
+                <w:color w:val="111111"/>
+                <w:sz w:val="17"/>
+                <w:szCs w:val="17"/>
+              </w:rPr>
+              <w:t xml:space="preserve">⌨  Generate a step</w:t>
+            </w:r>
+          </w:p>
+          <w:p>
+            <w:r>
+              <w:rPr>
+                <w:rFonts w:ascii="Consolas" w:cs="Consolas" w:eastAsia="Consolas" w:hAnsi="Consolas"/>
+                <w:color w:val="1A1A1A"/>
+                <w:sz w:val="21"/>
+                <w:szCs w:val="21"/>
+              </w:rPr>
+              <w:t xml:space="preserve">In Power Query I need a custom column that maps these Region values — North, north, N., NORTH — to a single clean "North" (same idea for the other regions). Give me the M for an Add Custom Column step.</w:t>
+            </w:r>
+          </w:p>
+        </w:tc>
+      </w:tr>
+    </w:tbl>
+    <w:p>
+      <w:pPr>
+        <w:spacing w:after="60"/>
+      </w:pPr>
+      <w:r>
+        <w:t xml:space="preserve"/>
+      </w:r>
+    </w:p>
+    <w:tbl>
+      <w:tblPr>
+        <w:tblW w:type="dxa" w:w="9360"/>
+        <w:tblBorders>
+          <w:top w:val="single" w:color="auto" w:sz="4"/>
+          <w:left w:val="single" w:color="auto" w:sz="4"/>
+          <w:bottom w:val="single" w:color="auto" w:sz="4"/>
+          <w:right w:val="single" w:color="auto" w:sz="4"/>
+          <w:insideH w:val="single" w:color="auto" w:sz="4"/>
+          <w:insideV w:val="single" w:color="auto" w:sz="4"/>
+        </w:tblBorders>
+        <w:tblCellMar>
+          <w:top w:type="dxa" w:w="60"/>
+          <w:bottom w:type="dxa" w:w="60"/>
+        </w:tblCellMar>
+      </w:tblPr>
+      <w:tblGrid>
+        <w:gridCol w:w="9360"/>
+      </w:tblGrid>
+      <w:tr>
+        <w:tc>
+          <w:tcPr>
+            <w:tcW w:type="dxa" w:w="9360"/>
+            <w:tcBorders>
+              <w:top w:val="single" w:color="111111" w:sz="4"/>
+              <w:left w:val="single" w:color="111111" w:sz="18"/>
+              <w:bottom w:val="single" w:color="111111" w:sz="4"/>
+              <w:right w:val="single" w:color="111111" w:sz="4"/>
+            </w:tcBorders>
+            <w:shd w:fill="F1F1F1" w:val="clear"/>
+            <w:tcMar>
+              <w:top w:type="dxa" w:w="120"/>
+              <w:left w:type="dxa" w:w="180"/>
+              <w:bottom w:type="dxa" w:w="120"/>
+              <w:right w:type="dxa" w:w="180"/>
+            </w:tcMar>
+          </w:tcPr>
+          <w:p>
+            <w:pPr>
+              <w:spacing w:after="60"/>
+            </w:pPr>
+            <w:r>
+              <w:rPr>
+                <w:b/>
+                <w:bCs/>
+                <w:caps/>
+                <w:color w:val="111111"/>
+                <w:sz w:val="17"/>
+                <w:szCs w:val="17"/>
+              </w:rPr>
+              <w:t xml:space="preserve">⌨  Fix an error</w:t>
+            </w:r>
+          </w:p>
+          <w:p>
+            <w:r>
+              <w:rPr>
+                <w:rFonts w:ascii="Consolas" w:cs="Consolas" w:eastAsia="Consolas" w:hAnsi="Consolas"/>
+                <w:color w:val="1A1A1A"/>
+                <w:sz w:val="21"/>
+                <w:szCs w:val="21"/>
+              </w:rPr>
+              <w:t xml:space="preserve">Power Query is throwing this error on my Amount column: [paste the error]. The column has values like "$1,250.00" and some blanks. What's causing it, and how do I fix it?</w:t>
+            </w:r>
+          </w:p>
+        </w:tc>
+      </w:tr>
+    </w:tbl>
+    <w:p>
+      <w:pPr>
+        <w:pStyle w:val="Heading2"/>
+      </w:pPr>
+      <w:r>
+        <w:t xml:space="preserve">Bonus Copilot prompts — extra mileage in the core demo</w:t>
+      </w:r>
+    </w:p>
+    <w:p>
+      <w:pPr>
+        <w:pStyle w:val="ListParagraph"/>
+        <w:numPr>
+          <w:ilvl w:val="0"/>
+          <w:numId w:val="2"/>
+        </w:numPr>
+        <w:spacing w:after="60"/>
+      </w:pPr>
+      <w:r>
+        <w:rPr>
+          <w:color w:val="1A1A1A"/>
+          <w:sz w:val="22"/>
+          <w:szCs w:val="22"/>
+        </w:rPr>
+        <w:t xml:space="preserve">Add a column that shows each sale as a percent of total sales.</w:t>
+      </w:r>
+    </w:p>
+    <w:p>
+      <w:pPr>
+        <w:pStyle w:val="ListParagraph"/>
+        <w:numPr>
+          <w:ilvl w:val="0"/>
+          <w:numId w:val="2"/>
+        </w:numPr>
+        <w:spacing w:after="60"/>
+      </w:pPr>
+      <w:r>
+        <w:rPr>
+          <w:color w:val="1A1A1A"/>
+          <w:sz w:val="22"/>
+          <w:szCs w:val="22"/>
+        </w:rPr>
+        <w:t xml:space="preserve">Flag any transaction over $10,000.</w:t>
+      </w:r>
+    </w:p>
+    <w:p>
+      <w:pPr>
+        <w:pStyle w:val="ListParagraph"/>
+        <w:numPr>
+          <w:ilvl w:val="0"/>
+          <w:numId w:val="2"/>
+        </w:numPr>
+        <w:spacing w:after="60"/>
+      </w:pPr>
+      <w:r>
+        <w:rPr>
+          <w:color w:val="1A1A1A"/>
+          <w:sz w:val="22"/>
+          <w:szCs w:val="22"/>
+        </w:rPr>
+        <w:t xml:space="preserve">Which sales rep has the highest total Amount Clean?</w:t>
+      </w:r>
+    </w:p>
+    <w:p>
+      <w:pPr>
+        <w:pStyle w:val="ListParagraph"/>
+        <w:numPr>
+          <w:ilvl w:val="0"/>
+          <w:numId w:val="2"/>
+        </w:numPr>
+        <w:spacing w:after="60"/>
+      </w:pPr>
+      <w:r>
+        <w:rPr>
+          <w:color w:val="1A1A1A"/>
+          <w:sz w:val="22"/>
+          <w:szCs w:val="22"/>
+        </w:rPr>
+        <w:t xml:space="preserve">Add a column with the month name from Date Clean.</w:t>
+      </w:r>
+    </w:p>
     <w:sectPr>
       <w:footerReference w:type="default" r:id="rId7"/>
       <w:pgSz w:w="12240" w:h="15840" w:orient="portrait"/>

</xml_diff>